<commit_message>
Atualiza Manual do Aluno IPS
</commit_message>
<xml_diff>
--- a/Manual-do-Aluno-IPS.docx
+++ b/Manual-do-Aluno-IPS.docx
@@ -6125,35 +6125,35 @@
         <w:jc w:val="both"/>
       </w:pPr>
       <w:r>
-        <w:t>Os sete passos podem ser utilizados em dois modos principais de experiência:</w:t>
-      </w:r>
-    </w:p>
-    <w:p>
-      <w:pPr>
-        <w:pStyle w:val="PargrafodaLista"/>
-        <w:numPr>
-          <w:ilvl w:val="0"/>
-          <w:numId w:val="2"/>
-        </w:numPr>
-        <w:spacing w:after="90" w:line="360" w:lineRule="auto"/>
-        <w:jc w:val="both"/>
-      </w:pPr>
-      <w:r>
-        <w:t>Modo Transformação — utilizado para trabalhar uma emoção, pensamento, crença, comportamento ou padrão corporal que a pessoa deseja transformar.</w:t>
-      </w:r>
-    </w:p>
-    <w:p>
-      <w:pPr>
-        <w:pStyle w:val="PargrafodaLista"/>
-        <w:numPr>
-          <w:ilvl w:val="0"/>
-          <w:numId w:val="2"/>
-        </w:numPr>
-        <w:spacing w:after="90" w:line="360" w:lineRule="auto"/>
-        <w:jc w:val="both"/>
-      </w:pPr>
-      <w:r>
-        <w:t>Modo Gratidão–Celebração — utilizado para entrar em contato corporal com a gratidão, expressá-la por meio de celebração e integrá-la como recurso.</w:t>
+        <w:t>Os sete passos podem ser utilizados por duas vias de transformação somatopsíquica:</w:t>
+      </w:r>
+    </w:p>
+    <w:p>
+      <w:pPr>
+        <w:pStyle w:val="PargrafodaLista"/>
+        <w:numPr>
+          <w:ilvl w:val="0"/>
+          <w:numId w:val="2"/>
+        </w:numPr>
+        <w:spacing w:after="90" w:line="360" w:lineRule="auto"/>
+        <w:jc w:val="both"/>
+      </w:pPr>
+      <w:r>
+        <w:t>Modo Transformação — via direta, utilizada para trabalhar uma emoção, pensamento, crença, comportamento ou padrão corporal que a pessoa deseja transformar.</w:t>
+      </w:r>
+    </w:p>
+    <w:p>
+      <w:pPr>
+        <w:pStyle w:val="PargrafodaLista"/>
+        <w:numPr>
+          <w:ilvl w:val="0"/>
+          <w:numId w:val="2"/>
+        </w:numPr>
+        <w:spacing w:after="90" w:line="360" w:lineRule="auto"/>
+        <w:jc w:val="both"/>
+      </w:pPr>
+      <w:r>
+        <w:t>Modo Gratidão–Celebração — via mediada por recursos, utilizada para entrar em contato corporal com a gratidão, expressá-la por meio da celebração e integrá-la como recurso capaz de ampliar a experiência e transformar a maneira de relacionar-se com uma situação.</w:t>
       </w:r>
     </w:p>
     <w:p>
@@ -6173,7 +6173,7 @@
           <w:iCs/>
           <w:color w:val="333333"/>
         </w:rPr>
-        <w:t>Os dois modos seguem a mesma arquitetura dos sete passos, mas possuem intenções e instruções específicas. O aplicador deve definir claramente o modo antes de iniciar a experiência.</w:t>
+        <w:t>Na IPS®, ambos os modos podem estar a serviço da transformação. O que os diferencia não é a possibilidade de mudança, mas o ponto de entrada da experiência: no Modo Transformação, parte-se diretamente daquilo que pede mudança; no Modo Gratidão–Celebração, parte-se de um recurso de gratidão. Os dois modos seguem a mesma arquitetura dos sete passos, com intenções e instruções específicas. O aplicador deve definir claramente o modo antes de iniciar a experiência.</w:t>
       </w:r>
     </w:p>
     <w:p>
@@ -6871,8 +6871,7 @@
         <w:jc w:val="both"/>
       </w:pPr>
       <w:r>
-        <w:lastRenderedPageBreak/>
-        <w:t>A pessoa observa como o corpo se encontra depois da celebração. Esse remapeamento ajuda a reconhecer os efeitos da expressão celebrativa e a integrar a gratidão como experiência corporificada.</w:t>
+        <w:t>A pessoa observa como o corpo se encontra depois da celebração. O remapeamento permite reconhecer como a experiência celebrativa repercutiu no corpo, acrescentando uma nova camada à gratidão inicialmente mapeada.</w:t>
       </w:r>
     </w:p>
     <w:p>
@@ -7635,7 +7634,7 @@
         <w:jc w:val="both"/>
       </w:pPr>
       <w:r>
-        <w:t>Neste modo, busca-se reconhecer, dentro de um conflito, algo verdadeiro pelo qual seja possível sentir gratidão.</w:t>
+        <w:t>Neste modo, a pessoa pensa na questão, reconhece dentro dela algo verdadeiro pelo qual pode sentir gratidão e realiza os sete passos a partir desse elemento. Após a experiência, a situação pode permanecer a mesma, mas a pessoa pode conseguir lidar com ela de maneira diferente, ampliar seus recursos e construir um novo olhar sobre o que viveu.</w:t>
       </w:r>
     </w:p>
     <w:p>
@@ -7718,7 +7717,7 @@
         <w:jc w:val="both"/>
       </w:pPr>
       <w:r>
-        <w:t>A escolha depende da intenção da experiência. Quando existe uma questão que a pessoa deseja compreender ou transformar, utiliza-se o Modo Transformação. Quando a intenção é reconhecer, ampliar e corporificar gratidão, utiliza-se o Modo Gratidão–Celebração.</w:t>
+        <w:t>A escolha depende da porta de entrada mais adequada para a experiência. Quando a pessoa deseja partir diretamente de uma questão, utiliza-se o Modo Transformação. Quando deseja partir de um recurso de gratidão — inclusive para ampliar a maneira de lidar com uma questão — utiliza-se o Modo Gratidão–Celebração. Ambos podem estar a serviço da transformação.</w:t>
       </w:r>
     </w:p>
     <w:p>
@@ -7747,8 +7746,7 @@
           <w:iCs/>
           <w:color w:val="333333"/>
         </w:rPr>
-        <w:lastRenderedPageBreak/>
-        <w:t>Modo Transformação: trabalhar uma questão. Modo Gratidão–Celebração: cultivar e corporificar gratidão.</w:t>
+        <w:t>Modo Transformação: via direta, partindo da questão que pede mudança. Modo Gratidão–Celebração: via mediada por um recurso de gratidão que pode ampliar e reorganizar a relação com a experiência.</w:t>
       </w:r>
     </w:p>
     <w:p>
@@ -7958,7 +7956,7 @@
         <w:jc w:val="both"/>
       </w:pPr>
       <w:r>
-        <w:t>Os sete passos transformam os pilares da Psiquiatria Somatopsíquica em uma experiência clínica organizada. O Modo Transformação utiliza essa sequência para trabalhar uma questão escolhida. O Modo Gratidão–Celebração utiliza a mesma arquitetura para mapear, expressar e integrar gratidão nos tipos “como se”, pescaria ou puro.</w:t>
+        <w:t>Os sete passos transformam os pilares da Psiquiatria Somatopsíquica em uma experiência clínica organizada. O Modo Transformação utiliza a sequência como via direta para trabalhar uma questão escolhida. O Modo Gratidão–Celebração utiliza a mesma arquitetura como via mediada por recursos para mapear, expressar e integrar gratidão nos tipos “como se”, pescaria ou puro. Ambos os modos podem produzir transformação.</w:t>
       </w:r>
     </w:p>
     <w:p>
@@ -7978,7 +7976,7 @@
           <w:iCs/>
           <w:color w:val="333333"/>
         </w:rPr>
-        <w:t>Uma arquitetura, dois modos: transformar o que pede cuidado ou celebrar aquilo que pode tornar-se recurso.</w:t>
+        <w:t>Uma arquitetura, duas vias de transformação somatopsíquica: partir diretamente do que pede mudança ou partir de um recurso de gratidão capaz de ampliar a experiência e favorecer um novo olhar.</w:t>
       </w:r>
     </w:p>
     <w:p>

</xml_diff>